<commit_message>
Se modificó lo del Token
</commit_message>
<xml_diff>
--- a/Documentacion P3 ENB.docx
+++ b/Documentacion P3 ENB.docx
@@ -159,21 +159,7 @@
           <w:sz w:val="40"/>
           <w:szCs w:val="40"/>
         </w:rPr>
-        <w:t>“</w:t>
-      </w:r>
-      <w:r>
-        <w:rPr>
-          <w:sz w:val="40"/>
-          <w:szCs w:val="40"/>
-        </w:rPr>
-        <w:t>Biblioteca digital</w:t>
-      </w:r>
-      <w:r>
-        <w:rPr>
-          <w:sz w:val="40"/>
-          <w:szCs w:val="40"/>
-        </w:rPr>
-        <w:t>”</w:t>
+        <w:t>“Biblioteca digital”</w:t>
       </w:r>
     </w:p>
     <w:p>
@@ -391,6 +377,7 @@
       </w:pPr>
       <w:r>
         <w:rPr>
+          <w:noProof/>
           <w:sz w:val="24"/>
           <w:szCs w:val="24"/>
         </w:rPr>
@@ -441,6 +428,7 @@
       </w:pPr>
       <w:r>
         <w:rPr>
+          <w:noProof/>
           <w:sz w:val="24"/>
           <w:szCs w:val="24"/>
         </w:rPr>
@@ -480,6 +468,85 @@
             </a:graphic>
           </wp:inline>
         </w:drawing>
+      </w:r>
+    </w:p>
+    <w:p>
+      <w:pPr>
+        <w:jc w:val="both"/>
+        <w:rPr>
+          <w:sz w:val="24"/>
+          <w:szCs w:val="24"/>
+        </w:rPr>
+      </w:pPr>
+      <w:r>
+        <w:rPr>
+          <w:sz w:val="24"/>
+          <w:szCs w:val="24"/>
+        </w:rPr>
+        <w:t xml:space="preserve">Para utilizar la </w:t>
+      </w:r>
+      <w:r>
+        <w:rPr>
+          <w:sz w:val="24"/>
+          <w:szCs w:val="24"/>
+        </w:rPr>
+        <w:t>API</w:t>
+      </w:r>
+      <w:r>
+        <w:rPr>
+          <w:sz w:val="24"/>
+          <w:szCs w:val="24"/>
+        </w:rPr>
+        <w:t xml:space="preserve"> en postman</w:t>
+      </w:r>
+      <w:r>
+        <w:rPr>
+          <w:sz w:val="24"/>
+          <w:szCs w:val="24"/>
+        </w:rPr>
+        <w:t xml:space="preserve">, primero le tenemos que hacer un </w:t>
+      </w:r>
+      <w:r>
+        <w:rPr>
+          <w:sz w:val="24"/>
+          <w:szCs w:val="24"/>
+        </w:rPr>
+        <w:t>POST a la autenticación que sería con el endpoint</w:t>
+      </w:r>
+    </w:p>
+    <w:p>
+      <w:pPr>
+        <w:jc w:val="both"/>
+        <w:rPr>
+          <w:sz w:val="24"/>
+          <w:szCs w:val="24"/>
+        </w:rPr>
+      </w:pPr>
+      <w:hyperlink r:id="rId7" w:history="1">
+        <w:r>
+          <w:rPr>
+            <w:rStyle w:val="Hyperlink"/>
+            <w:sz w:val="24"/>
+            <w:szCs w:val="24"/>
+          </w:rPr>
+          <w:t>http://localhost:8080/api/auth/login</w:t>
+        </w:r>
+      </w:hyperlink>
+    </w:p>
+    <w:p>
+      <w:pPr>
+        <w:jc w:val="both"/>
+        <w:rPr>
+          <w:sz w:val="24"/>
+          <w:szCs w:val="24"/>
+        </w:rPr>
+      </w:pPr>
+      <w:r>
+        <w:rPr>
+          <w:sz w:val="24"/>
+          <w:szCs w:val="24"/>
+        </w:rPr>
+        <w:t>Y utilizando los datos del administrador para ser admin.</w:t>
       </w:r>
     </w:p>
     <w:sectPr>
@@ -896,11 +963,11 @@
       <w:kern w:val="2"/>
     </w:rPr>
   </w:style>
-  <w:style w:type="paragraph" w:styleId="Ttulo1">
+  <w:style w:type="paragraph" w:styleId="Heading1">
     <w:name w:val="heading 1"/>
     <w:basedOn w:val="Normal"/>
     <w:next w:val="Normal"/>
-    <w:link w:val="Ttulo1Car"/>
+    <w:link w:val="Heading1Char"/>
     <w:uiPriority w:val="9"/>
     <w:qFormat/>
     <w:rsid w:val="00226877"/>
@@ -918,11 +985,11 @@
       <w:szCs w:val="40"/>
     </w:rPr>
   </w:style>
-  <w:style w:type="paragraph" w:styleId="Ttulo2">
+  <w:style w:type="paragraph" w:styleId="Heading2">
     <w:name w:val="heading 2"/>
     <w:basedOn w:val="Normal"/>
     <w:next w:val="Normal"/>
-    <w:link w:val="Ttulo2Car"/>
+    <w:link w:val="Heading2Char"/>
     <w:uiPriority w:val="9"/>
     <w:semiHidden/>
     <w:unhideWhenUsed/>
@@ -942,11 +1009,11 @@
       <w:szCs w:val="32"/>
     </w:rPr>
   </w:style>
-  <w:style w:type="paragraph" w:styleId="Ttulo3">
+  <w:style w:type="paragraph" w:styleId="Heading3">
     <w:name w:val="heading 3"/>
     <w:basedOn w:val="Normal"/>
     <w:next w:val="Normal"/>
-    <w:link w:val="Ttulo3Car"/>
+    <w:link w:val="Heading3Char"/>
     <w:uiPriority w:val="9"/>
     <w:semiHidden/>
     <w:unhideWhenUsed/>
@@ -966,11 +1033,11 @@
       <w:szCs w:val="28"/>
     </w:rPr>
   </w:style>
-  <w:style w:type="paragraph" w:styleId="Ttulo4">
+  <w:style w:type="paragraph" w:styleId="Heading4">
     <w:name w:val="heading 4"/>
     <w:basedOn w:val="Normal"/>
     <w:next w:val="Normal"/>
-    <w:link w:val="Ttulo4Car"/>
+    <w:link w:val="Heading4Char"/>
     <w:uiPriority w:val="9"/>
     <w:semiHidden/>
     <w:unhideWhenUsed/>
@@ -990,11 +1057,11 @@
       <w:kern w:val="0"/>
     </w:rPr>
   </w:style>
-  <w:style w:type="paragraph" w:styleId="Ttulo5">
+  <w:style w:type="paragraph" w:styleId="Heading5">
     <w:name w:val="heading 5"/>
     <w:basedOn w:val="Normal"/>
     <w:next w:val="Normal"/>
-    <w:link w:val="Ttulo5Car"/>
+    <w:link w:val="Heading5Char"/>
     <w:uiPriority w:val="9"/>
     <w:semiHidden/>
     <w:unhideWhenUsed/>
@@ -1012,11 +1079,11 @@
       <w:kern w:val="0"/>
     </w:rPr>
   </w:style>
-  <w:style w:type="paragraph" w:styleId="Ttulo6">
+  <w:style w:type="paragraph" w:styleId="Heading6">
     <w:name w:val="heading 6"/>
     <w:basedOn w:val="Normal"/>
     <w:next w:val="Normal"/>
-    <w:link w:val="Ttulo6Car"/>
+    <w:link w:val="Heading6Char"/>
     <w:uiPriority w:val="9"/>
     <w:semiHidden/>
     <w:unhideWhenUsed/>
@@ -1036,11 +1103,11 @@
       <w:kern w:val="0"/>
     </w:rPr>
   </w:style>
-  <w:style w:type="paragraph" w:styleId="Ttulo7">
+  <w:style w:type="paragraph" w:styleId="Heading7">
     <w:name w:val="heading 7"/>
     <w:basedOn w:val="Normal"/>
     <w:next w:val="Normal"/>
-    <w:link w:val="Ttulo7Car"/>
+    <w:link w:val="Heading7Char"/>
     <w:uiPriority w:val="9"/>
     <w:semiHidden/>
     <w:unhideWhenUsed/>
@@ -1058,11 +1125,11 @@
       <w:kern w:val="0"/>
     </w:rPr>
   </w:style>
-  <w:style w:type="paragraph" w:styleId="Ttulo8">
+  <w:style w:type="paragraph" w:styleId="Heading8">
     <w:name w:val="heading 8"/>
     <w:basedOn w:val="Normal"/>
     <w:next w:val="Normal"/>
-    <w:link w:val="Ttulo8Car"/>
+    <w:link w:val="Heading8Char"/>
     <w:uiPriority w:val="9"/>
     <w:semiHidden/>
     <w:unhideWhenUsed/>
@@ -1082,11 +1149,11 @@
       <w:kern w:val="0"/>
     </w:rPr>
   </w:style>
-  <w:style w:type="paragraph" w:styleId="Ttulo9">
+  <w:style w:type="paragraph" w:styleId="Heading9">
     <w:name w:val="heading 9"/>
     <w:basedOn w:val="Normal"/>
     <w:next w:val="Normal"/>
-    <w:link w:val="Ttulo9Car"/>
+    <w:link w:val="Heading9Char"/>
     <w:uiPriority w:val="9"/>
     <w:semiHidden/>
     <w:unhideWhenUsed/>
@@ -1104,13 +1171,12 @@
       <w:kern w:val="0"/>
     </w:rPr>
   </w:style>
-  <w:style w:type="character" w:default="1" w:styleId="Fuentedeprrafopredeter">
+  <w:style w:type="character" w:default="1" w:styleId="DefaultParagraphFont">
     <w:name w:val="Default Paragraph Font"/>
     <w:uiPriority w:val="1"/>
-    <w:semiHidden/>
     <w:unhideWhenUsed/>
   </w:style>
-  <w:style w:type="table" w:default="1" w:styleId="Tablanormal">
+  <w:style w:type="table" w:default="1" w:styleId="TableNormal">
     <w:name w:val="Normal Table"/>
     <w:uiPriority w:val="99"/>
     <w:semiHidden/>
@@ -1125,16 +1191,16 @@
       </w:tblCellMar>
     </w:tblPr>
   </w:style>
-  <w:style w:type="numbering" w:default="1" w:styleId="Sinlista">
+  <w:style w:type="numbering" w:default="1" w:styleId="NoList">
     <w:name w:val="No List"/>
     <w:uiPriority w:val="99"/>
     <w:semiHidden/>
     <w:unhideWhenUsed/>
   </w:style>
-  <w:style w:type="character" w:customStyle="1" w:styleId="Ttulo1Car">
-    <w:name w:val="Título 1 Car"/>
-    <w:basedOn w:val="Fuentedeprrafopredeter"/>
-    <w:link w:val="Ttulo1"/>
+  <w:style w:type="character" w:customStyle="1" w:styleId="Heading1Char">
+    <w:name w:val="Heading 1 Char"/>
+    <w:basedOn w:val="DefaultParagraphFont"/>
+    <w:link w:val="Heading1"/>
     <w:uiPriority w:val="9"/>
     <w:rsid w:val="00226877"/>
     <w:rPr>
@@ -1144,10 +1210,10 @@
       <w:szCs w:val="40"/>
     </w:rPr>
   </w:style>
-  <w:style w:type="character" w:customStyle="1" w:styleId="Ttulo2Car">
-    <w:name w:val="Título 2 Car"/>
-    <w:basedOn w:val="Fuentedeprrafopredeter"/>
-    <w:link w:val="Ttulo2"/>
+  <w:style w:type="character" w:customStyle="1" w:styleId="Heading2Char">
+    <w:name w:val="Heading 2 Char"/>
+    <w:basedOn w:val="DefaultParagraphFont"/>
+    <w:link w:val="Heading2"/>
     <w:uiPriority w:val="9"/>
     <w:semiHidden/>
     <w:rsid w:val="00226877"/>
@@ -1158,10 +1224,10 @@
       <w:szCs w:val="32"/>
     </w:rPr>
   </w:style>
-  <w:style w:type="character" w:customStyle="1" w:styleId="Ttulo3Car">
-    <w:name w:val="Título 3 Car"/>
-    <w:basedOn w:val="Fuentedeprrafopredeter"/>
-    <w:link w:val="Ttulo3"/>
+  <w:style w:type="character" w:customStyle="1" w:styleId="Heading3Char">
+    <w:name w:val="Heading 3 Char"/>
+    <w:basedOn w:val="DefaultParagraphFont"/>
+    <w:link w:val="Heading3"/>
     <w:uiPriority w:val="9"/>
     <w:semiHidden/>
     <w:rsid w:val="00226877"/>
@@ -1172,10 +1238,10 @@
       <w:szCs w:val="28"/>
     </w:rPr>
   </w:style>
-  <w:style w:type="character" w:customStyle="1" w:styleId="Ttulo4Car">
-    <w:name w:val="Título 4 Car"/>
-    <w:basedOn w:val="Fuentedeprrafopredeter"/>
-    <w:link w:val="Ttulo4"/>
+  <w:style w:type="character" w:customStyle="1" w:styleId="Heading4Char">
+    <w:name w:val="Heading 4 Char"/>
+    <w:basedOn w:val="DefaultParagraphFont"/>
+    <w:link w:val="Heading4"/>
     <w:uiPriority w:val="9"/>
     <w:semiHidden/>
     <w:rsid w:val="00226877"/>
@@ -1186,10 +1252,10 @@
       <w:color w:val="0F4761" w:themeColor="accent1" w:themeShade="BF"/>
     </w:rPr>
   </w:style>
-  <w:style w:type="character" w:customStyle="1" w:styleId="Ttulo5Car">
-    <w:name w:val="Título 5 Car"/>
-    <w:basedOn w:val="Fuentedeprrafopredeter"/>
-    <w:link w:val="Ttulo5"/>
+  <w:style w:type="character" w:customStyle="1" w:styleId="Heading5Char">
+    <w:name w:val="Heading 5 Char"/>
+    <w:basedOn w:val="DefaultParagraphFont"/>
+    <w:link w:val="Heading5"/>
     <w:uiPriority w:val="9"/>
     <w:semiHidden/>
     <w:rsid w:val="00226877"/>
@@ -1198,10 +1264,10 @@
       <w:color w:val="0F4761" w:themeColor="accent1" w:themeShade="BF"/>
     </w:rPr>
   </w:style>
-  <w:style w:type="character" w:customStyle="1" w:styleId="Ttulo6Car">
-    <w:name w:val="Título 6 Car"/>
-    <w:basedOn w:val="Fuentedeprrafopredeter"/>
-    <w:link w:val="Ttulo6"/>
+  <w:style w:type="character" w:customStyle="1" w:styleId="Heading6Char">
+    <w:name w:val="Heading 6 Char"/>
+    <w:basedOn w:val="DefaultParagraphFont"/>
+    <w:link w:val="Heading6"/>
     <w:uiPriority w:val="9"/>
     <w:semiHidden/>
     <w:rsid w:val="00226877"/>
@@ -1212,10 +1278,10 @@
       <w:color w:val="595959" w:themeColor="text1" w:themeTint="A6"/>
     </w:rPr>
   </w:style>
-  <w:style w:type="character" w:customStyle="1" w:styleId="Ttulo7Car">
-    <w:name w:val="Título 7 Car"/>
-    <w:basedOn w:val="Fuentedeprrafopredeter"/>
-    <w:link w:val="Ttulo7"/>
+  <w:style w:type="character" w:customStyle="1" w:styleId="Heading7Char">
+    <w:name w:val="Heading 7 Char"/>
+    <w:basedOn w:val="DefaultParagraphFont"/>
+    <w:link w:val="Heading7"/>
     <w:uiPriority w:val="9"/>
     <w:semiHidden/>
     <w:rsid w:val="00226877"/>
@@ -1224,10 +1290,10 @@
       <w:color w:val="595959" w:themeColor="text1" w:themeTint="A6"/>
     </w:rPr>
   </w:style>
-  <w:style w:type="character" w:customStyle="1" w:styleId="Ttulo8Car">
-    <w:name w:val="Título 8 Car"/>
-    <w:basedOn w:val="Fuentedeprrafopredeter"/>
-    <w:link w:val="Ttulo8"/>
+  <w:style w:type="character" w:customStyle="1" w:styleId="Heading8Char">
+    <w:name w:val="Heading 8 Char"/>
+    <w:basedOn w:val="DefaultParagraphFont"/>
+    <w:link w:val="Heading8"/>
     <w:uiPriority w:val="9"/>
     <w:semiHidden/>
     <w:rsid w:val="00226877"/>
@@ -1238,10 +1304,10 @@
       <w:color w:val="272727" w:themeColor="text1" w:themeTint="D8"/>
     </w:rPr>
   </w:style>
-  <w:style w:type="character" w:customStyle="1" w:styleId="Ttulo9Car">
-    <w:name w:val="Título 9 Car"/>
-    <w:basedOn w:val="Fuentedeprrafopredeter"/>
-    <w:link w:val="Ttulo9"/>
+  <w:style w:type="character" w:customStyle="1" w:styleId="Heading9Char">
+    <w:name w:val="Heading 9 Char"/>
+    <w:basedOn w:val="DefaultParagraphFont"/>
+    <w:link w:val="Heading9"/>
     <w:uiPriority w:val="9"/>
     <w:semiHidden/>
     <w:rsid w:val="00226877"/>
@@ -1250,11 +1316,11 @@
       <w:color w:val="272727" w:themeColor="text1" w:themeTint="D8"/>
     </w:rPr>
   </w:style>
-  <w:style w:type="paragraph" w:styleId="Ttulo">
+  <w:style w:type="paragraph" w:styleId="Title">
     <w:name w:val="Title"/>
     <w:basedOn w:val="Normal"/>
     <w:next w:val="Normal"/>
-    <w:link w:val="TtuloCar"/>
+    <w:link w:val="TitleChar"/>
     <w:uiPriority w:val="10"/>
     <w:qFormat/>
     <w:rsid w:val="00226877"/>
@@ -1270,10 +1336,10 @@
       <w:szCs w:val="56"/>
     </w:rPr>
   </w:style>
-  <w:style w:type="character" w:customStyle="1" w:styleId="TtuloCar">
-    <w:name w:val="Título Car"/>
-    <w:basedOn w:val="Fuentedeprrafopredeter"/>
-    <w:link w:val="Ttulo"/>
+  <w:style w:type="character" w:customStyle="1" w:styleId="TitleChar">
+    <w:name w:val="Title Char"/>
+    <w:basedOn w:val="DefaultParagraphFont"/>
+    <w:link w:val="Title"/>
     <w:uiPriority w:val="10"/>
     <w:rsid w:val="00226877"/>
     <w:rPr>
@@ -1284,11 +1350,11 @@
       <w:szCs w:val="56"/>
     </w:rPr>
   </w:style>
-  <w:style w:type="paragraph" w:styleId="Subttulo">
+  <w:style w:type="paragraph" w:styleId="Subtitle">
     <w:name w:val="Subtitle"/>
     <w:basedOn w:val="Normal"/>
     <w:next w:val="Normal"/>
-    <w:link w:val="SubttuloCar"/>
+    <w:link w:val="SubtitleChar"/>
     <w:uiPriority w:val="11"/>
     <w:qFormat/>
     <w:rsid w:val="00226877"/>
@@ -1306,10 +1372,10 @@
       <w:szCs w:val="28"/>
     </w:rPr>
   </w:style>
-  <w:style w:type="character" w:customStyle="1" w:styleId="SubttuloCar">
-    <w:name w:val="Subtítulo Car"/>
-    <w:basedOn w:val="Fuentedeprrafopredeter"/>
-    <w:link w:val="Subttulo"/>
+  <w:style w:type="character" w:customStyle="1" w:styleId="SubtitleChar">
+    <w:name w:val="Subtitle Char"/>
+    <w:basedOn w:val="DefaultParagraphFont"/>
+    <w:link w:val="Subtitle"/>
     <w:uiPriority w:val="11"/>
     <w:rsid w:val="00226877"/>
     <w:rPr>
@@ -1320,11 +1386,11 @@
       <w:szCs w:val="28"/>
     </w:rPr>
   </w:style>
-  <w:style w:type="paragraph" w:styleId="Cita">
+  <w:style w:type="paragraph" w:styleId="Quote">
     <w:name w:val="Quote"/>
     <w:basedOn w:val="Normal"/>
     <w:next w:val="Normal"/>
-    <w:link w:val="CitaCar"/>
+    <w:link w:val="QuoteChar"/>
     <w:uiPriority w:val="29"/>
     <w:qFormat/>
     <w:rsid w:val="00226877"/>
@@ -1339,10 +1405,10 @@
       <w:kern w:val="0"/>
     </w:rPr>
   </w:style>
-  <w:style w:type="character" w:customStyle="1" w:styleId="CitaCar">
-    <w:name w:val="Cita Car"/>
-    <w:basedOn w:val="Fuentedeprrafopredeter"/>
-    <w:link w:val="Cita"/>
+  <w:style w:type="character" w:customStyle="1" w:styleId="QuoteChar">
+    <w:name w:val="Quote Char"/>
+    <w:basedOn w:val="DefaultParagraphFont"/>
+    <w:link w:val="Quote"/>
     <w:uiPriority w:val="29"/>
     <w:rsid w:val="00226877"/>
     <w:rPr>
@@ -1351,7 +1417,7 @@
       <w:color w:val="404040" w:themeColor="text1" w:themeTint="BF"/>
     </w:rPr>
   </w:style>
-  <w:style w:type="paragraph" w:styleId="Prrafodelista">
+  <w:style w:type="paragraph" w:styleId="ListParagraph">
     <w:name w:val="List Paragraph"/>
     <w:basedOn w:val="Normal"/>
     <w:uiPriority w:val="34"/>
@@ -1365,9 +1431,9 @@
       <w:kern w:val="0"/>
     </w:rPr>
   </w:style>
-  <w:style w:type="character" w:styleId="nfasisintenso">
+  <w:style w:type="character" w:styleId="IntenseEmphasis">
     <w:name w:val="Intense Emphasis"/>
-    <w:basedOn w:val="Fuentedeprrafopredeter"/>
+    <w:basedOn w:val="DefaultParagraphFont"/>
     <w:uiPriority w:val="21"/>
     <w:qFormat/>
     <w:rsid w:val="00226877"/>
@@ -1377,11 +1443,11 @@
       <w:color w:val="0F4761" w:themeColor="accent1" w:themeShade="BF"/>
     </w:rPr>
   </w:style>
-  <w:style w:type="paragraph" w:styleId="Citadestacada">
+  <w:style w:type="paragraph" w:styleId="IntenseQuote">
     <w:name w:val="Intense Quote"/>
     <w:basedOn w:val="Normal"/>
     <w:next w:val="Normal"/>
-    <w:link w:val="CitadestacadaCar"/>
+    <w:link w:val="IntenseQuoteChar"/>
     <w:uiPriority w:val="30"/>
     <w:qFormat/>
     <w:rsid w:val="00226877"/>
@@ -1401,10 +1467,10 @@
       <w:kern w:val="0"/>
     </w:rPr>
   </w:style>
-  <w:style w:type="character" w:customStyle="1" w:styleId="CitadestacadaCar">
-    <w:name w:val="Cita destacada Car"/>
-    <w:basedOn w:val="Fuentedeprrafopredeter"/>
-    <w:link w:val="Citadestacada"/>
+  <w:style w:type="character" w:customStyle="1" w:styleId="IntenseQuoteChar">
+    <w:name w:val="Intense Quote Char"/>
+    <w:basedOn w:val="DefaultParagraphFont"/>
+    <w:link w:val="IntenseQuote"/>
     <w:uiPriority w:val="30"/>
     <w:rsid w:val="00226877"/>
     <w:rPr>
@@ -1413,9 +1479,9 @@
       <w:color w:val="0F4761" w:themeColor="accent1" w:themeShade="BF"/>
     </w:rPr>
   </w:style>
-  <w:style w:type="character" w:styleId="Referenciaintensa">
+  <w:style w:type="character" w:styleId="IntenseReference">
     <w:name w:val="Intense Reference"/>
-    <w:basedOn w:val="Fuentedeprrafopredeter"/>
+    <w:basedOn w:val="DefaultParagraphFont"/>
     <w:uiPriority w:val="32"/>
     <w:qFormat/>
     <w:rsid w:val="00226877"/>
@@ -1425,6 +1491,29 @@
       <w:smallCaps/>
       <w:color w:val="0F4761" w:themeColor="accent1" w:themeShade="BF"/>
       <w:spacing w:val="5"/>
+    </w:rPr>
+  </w:style>
+  <w:style w:type="character" w:styleId="Hyperlink">
+    <w:name w:val="Hyperlink"/>
+    <w:basedOn w:val="DefaultParagraphFont"/>
+    <w:uiPriority w:val="99"/>
+    <w:unhideWhenUsed/>
+    <w:rsid w:val="007E7FFD"/>
+    <w:rPr>
+      <w:color w:val="467886" w:themeColor="hyperlink"/>
+      <w:u w:val="single"/>
+    </w:rPr>
+  </w:style>
+  <w:style w:type="character" w:styleId="UnresolvedMention">
+    <w:name w:val="Unresolved Mention"/>
+    <w:basedOn w:val="DefaultParagraphFont"/>
+    <w:uiPriority w:val="99"/>
+    <w:semiHidden/>
+    <w:unhideWhenUsed/>
+    <w:rsid w:val="007E7FFD"/>
+    <w:rPr>
+      <w:color w:val="605E5C"/>
+      <w:shd w:val="clear" w:color="auto" w:fill="E1DFDD"/>
     </w:rPr>
   </w:style>
 </w:styles>

</xml_diff>